<commit_message>
docs: refina e expande as seções 1–4 (Template de Refinamento)
- §1 explicita por que a empresa nasceu e o diferencial (hiper-especialização)
- §2 adiciona fonte do dado dos 5% [fonte a confirmar] e impacto no DF
- §3 nomeia os 5 produtos distintos com o problema que cada um resolve + "Código Fluente"
- §4 reforça a progressão piloto → sustentabilidade → inovação, com ações concretas
- Documento regenerado a partir das seções atualizadas

Co-Authored-By: Claude Opus 4.8 <noreply@anthropic.com>
</commit_message>
<xml_diff>
--- a/babelstack-junior/docs/BabelStack_Junior_Documento_v0.1.docx
+++ b/babelstack-junior/docs/BabelStack_Junior_Documento_v0.1.docx
@@ -264,7 +264,7 @@
           <w:b w:val="false"/>
           <w:bCs w:val="false"/>
         </w:rPr>
-        <w:t xml:space="preserve"> Soluções tecnológicas para educação de idiomas (EdTech), com foco em Engenharia de Software, Business Intelligence e Design de Experiência do Usuário (UX/UI).</w:t>
+        <w:t xml:space="preserve"> soluções tecnológicas para a educação de idiomas (EdTech), com foco em Engenharia de Software, Business Intelligence e Design de Experiência do Usuário (UX/UI).</w:t>
       </w:r>
     </w:p>
     <w:p>
@@ -284,7 +284,7 @@
           <w:b w:val="false"/>
           <w:bCs w:val="false"/>
         </w:rPr>
-        <w:t xml:space="preserve">A BabelStack Júnior é uma associação civil sem fins lucrativos gerida exclusivamente por estudantes de Sistemas de Informação. Especializada no desenvolvimento de tecnologias para o ensino e aprendizado de línguas estrangeiras, atua como uma ponte entre a pedagogia e a engenharia de software. O portfólio engloba desde plataformas web interativas e aplicações voltadas à imersão no idioma (com ênfase inicial no inglês e arquitetura escalável para outras línguas) até painéis de análise de dados (dashboards) que auxiliam escolas e professores a monitorar o engajamento e a retenção de seus alunos.</w:t>
+        <w:t xml:space="preserve">A BabelStack Júnior é uma associação civil sem fins lucrativos, gerida exclusivamente por estudantes de Sistemas de Informação e regida pela Lei Federal nº 13.267/2016. Especializada no desenvolvimento de tecnologias para o ensino e o aprendizado de línguas estrangeiras, atua como uma ponte entre a pedagogia e a engenharia de software. Seu portfólio vai de plataformas web interativas voltadas à imersão no idioma — com ênfase inicial no inglês e arquitetura escalável para outras línguas — até painéis de análise de dados (dashboards) que ajudam escolas e professores a monitorar o engajamento e a retenção dos alunos. O que distingue a empresa é a hiper-especialização no nicho de idiomas: em vez de software genérico, cada solução nasce de uma dor concreta da sala de aula.</w:t>
       </w:r>
     </w:p>
     <w:p>
@@ -304,7 +304,7 @@
           <w:b w:val="false"/>
           <w:bCs w:val="false"/>
         </w:rPr>
-        <w:t xml:space="preserve">Fundada por graduandos em Sistemas de Informação no Distrito Federal, a empresa nasceu da intersecção entre o desenvolvimento de software e a proficiência avançada em línguas estrangeiras de seus idealizadores. Durante a jornada acadêmica, o grupo percebeu que, embora o domínio do inglês fosse uma ferramenta crucial para profissionais de tecnologia, as plataformas de ensino tradicionais frequentemente careciam de interfaces intuitivas e ferramentas de apoio focadas em metodologias ativas. A ideia ganhou força com o desenvolvimento de protótipos experimentais — de sistemas de anotações visuais a lógicas de banco de dados para gestão de alunos. Compreendendo o potencial comercial e social dessas ferramentas, os estudantes decidiram formalizar o projeto, dando origem à BabelStack Júnior.</w:t>
+        <w:t xml:space="preserve">A BabelStack Júnior nasceu no Distrito Federal, da intersecção entre o desenvolvimento de software e a proficiência avançada em línguas estrangeiras de seus fundadores. Ao longo da graduação, a dupla percebeu um descompasso: embora o inglês seja hoje um pré-requisito para a carreira em tecnologia, as plataformas tradicionais de ensino costumam falhar justamente onde mais importa — interfaces pouco intuitivas, ausência de metodologias ativas e nenhuma visão de dados sobre o progresso do aluno. A ideia ganhou corpo durante o desenvolvimento de protótipos experimentais, de sistemas de anotação visual a bancos de dados para gestão de turmas. Compreendendo o potencial social e comercial dessas ferramentas, os fundadores decidiram formalizar o projeto como Empresa Júnior, transformando conhecimento técnico avançado em soluções acessíveis para educadores e instituições.</w:t>
       </w:r>
     </w:p>
     <w:p>
@@ -400,7 +400,7 @@
           <w:b w:val="false"/>
           <w:bCs w:val="false"/>
         </w:rPr>
-        <w:t xml:space="preserve"> uso de métricas e Business Intelligence para gerar resultados educacionais concretos.</w:t>
+        <w:t xml:space="preserve"> uso de métricas e Business Intelligence para gerar resultados educacionais concretos, em vez de decisões baseadas em "achismo".</w:t>
       </w:r>
     </w:p>
     <w:p>
@@ -448,7 +448,7 @@
           <w:b w:val="false"/>
           <w:bCs w:val="false"/>
         </w:rPr>
-        <w:t xml:space="preserve"> transformar a pesquisa de sala de aula e as linguagens de programação atuais em soluções práticas.</w:t>
+        <w:t xml:space="preserve"> transformar a pesquisa de sala de aula e as linguagens de programação atuais em soluções práticas para a sociedade.</w:t>
       </w:r>
     </w:p>
     <w:p>
@@ -514,7 +514,7 @@
           <w:b w:val="false"/>
           <w:bCs w:val="false"/>
         </w:rPr>
-        <w:t xml:space="preserve">O Brasil enfrenta um déficit histórico e estrutural no domínio de línguas estrangeiras. Dados de mercado indicam que apenas cerca de 5% da população brasileira fala inglês, e menos de 1% possui fluência avançada [estimativa — fontes usuais: British Council e EF EPI]. Nas escolas públicas, esse abismo linguístico é aprofundado por três gargalos: a falta de ferramentas tecnológicas que suportem metodologias ativas, a ausência de interfaces de estudo engajadoras (que reduzam a carga cognitiva do aluno) e a carência de sistemas de análise de dados (Business Intelligence) para que gestores monitorem, em tempo real, a evasão e a progressão dos estudantes. A necessidade primária é a democratização de tecnologias educacionais de alto nível metodológico, capazes de transformar o ensino passivo em uma experiência interativa, visual e mensurável.</w:t>
+        <w:t xml:space="preserve">O Brasil enfrenta um déficit histórico e estrutural no domínio de línguas estrangeiras. Estima-se que apenas cerca de 5% da população brasileira fale inglês e que menos de 1% tenha fluência avançada [estimativa; fonte a confirmar — pesquisa "Demandas de Aprendizagem de Inglês no Brasil" (British Council, 2014) e o índice EF EPI]. Na rede pública, esse abismo é aprofundado por três gargalos: a falta de ferramentas tecnológicas que sustentem metodologias ativas; a ausência de interfaces de estudo engajadoras, que reduzam a carga cognitiva do aluno; e a carência de sistemas de análise de dados (Business Intelligence) que permitam aos gestores acompanhar, em tempo real, a evasão e a progressão dos estudantes. A necessidade primária, portanto, é democratizar tecnologias educacionais de alto nível metodológico, capazes de transformar o ensino passivo em uma experiência interativa, visual e mensurável.</w:t>
       </w:r>
     </w:p>
     <w:p>
@@ -534,7 +534,7 @@
           <w:b w:val="false"/>
           <w:bCs w:val="false"/>
         </w:rPr>
-        <w:t xml:space="preserve">A identificação decorreu da intersecção entre a análise de indicadores educacionais nacionais e a vivência direta da dinâmica administrativa e governamental no Distrito Federal. Observou-se que a infraestrutura tecnológica das escolas raramente é acompanhada por softwares customizados para a realidade do aluno da rede pública. A validação também ocorreu durante o desenvolvimento experimental de plataformas de anotação visual e protótipos de estudo de idiomas: esses testes evidenciaram que, com excelência em UX/UI e recursos de imersão visual, a retenção de vocabulário e a motivação aumentam de forma expressiva.</w:t>
+        <w:t xml:space="preserve">A identificação resultou do cruzamento entre a análise de indicadores educacionais nacionais e a vivência direta da dinâmica administrativa e governamental no Distrito Federal. Observou-se que a infraestrutura tecnológica das escolas raramente é acompanhada por softwares customizados para a realidade do aluno da rede pública. A validação ocorreu também durante o desenvolvimento experimental de plataformas de anotação visual e de protótipos de estudo de idiomas: esses testes evidenciaram que, com excelência em UX/UI e recursos de imersão visual, a retenção de vocabulário e a motivação do aluno aumentam de forma expressiva.</w:t>
       </w:r>
     </w:p>
     <w:p>
@@ -554,7 +554,7 @@
           <w:b w:val="false"/>
           <w:bCs w:val="false"/>
         </w:rPr>
-        <w:t xml:space="preserve">O público-alvo principal são as escolas públicas da rede de ensino do Distrito Federal (vinculadas à Secretaria de Estado de Educação do DF), abrangendo gestões escolares e o corpo docente de inglês e línguas estrangeiras modernas. Secundariamente, a solução atinge os alunos do Ensino Fundamental II e Ensino Médio dessas instituições, usuários finais das plataformas desenvolvidas.</w:t>
+        <w:t xml:space="preserve">O público-alvo principal são as escolas públicas da rede de ensino do Distrito Federal (vinculadas à Secretaria de Estado de Educação do DF), incluindo as gestões escolares, o corpo docente de inglês e línguas estrangeiras modernas e, em especial, os Centros Interescolares de Línguas (CILs). Secundariamente, a solução alcança os próprios alunos do Ensino Fundamental II e do Ensino Médio dessas instituições, usuários finais das plataformas desenvolvidas.</w:t>
       </w:r>
     </w:p>
     <w:p>
@@ -574,7 +574,7 @@
           <w:b w:val="false"/>
           <w:bCs w:val="false"/>
         </w:rPr>
-        <w:t xml:space="preserve">A limitação no domínio do inglês atua como severa barreira de mobilidade social e econômica, perpetuando a desigualdade no acesso ao mercado de trabalho qualificado — onde o inglês deixou de ser diferencial para se tornar pré-requisito eliminatório — e limitando o acesso de jovens de baixa renda à literatura científica, a intercâmbios e a oportunidades globais. Ao intervir nesse cenário, a BabelStack Júnior projeta um impacto transformador: fornecer à rede pública infraestrutura de software de padrão internacional, equipando professores com dashboards pedagógicos e alunos com aplicativos intuitivos, promovendo inclusão digital e fluência.</w:t>
+        <w:t xml:space="preserve">A limitação no domínio do inglês atua como severa barreira de mobilidade social e econômica: perpetua a desigualdade no acesso ao mercado de trabalho qualificado — onde o idioma deixou de ser diferencial para se tornar pré-requisito eliminatório — e restringe o acesso de jovens de baixa renda à literatura científica, a intercâmbios e a oportunidades globais. No Distrito Federal, onde convivem escolas de excelência e unidades com forte vulnerabilidade social, esse hiato aprofunda a distância entre as redes pública e privada. Ao intervir nesse cenário, a BabelStack Júnior projeta um impacto transformador: levar à rede pública distrital infraestrutura de software de padrão internacional, equipando professores com dashboards pedagógicos e alunos com aplicativos intuitivos, e promovendo, ao mesmo tempo, inclusão digital e fluência linguística.</w:t>
       </w:r>
     </w:p>
     <w:p>
@@ -603,127 +603,127 @@
           <w:b w:val="false"/>
           <w:bCs w:val="false"/>
         </w:rPr>
-        <w:t xml:space="preserve">Por ser formada por estudantes de Sistemas de Informação, a BabelStack Júnior estruturou um portfólio inteligente, com tecnologias consolidadas (desenvolvimento web, análise de dados e design de interfaces) que garantem viabilidade técnica de execução e alto valor para as escolas:</w:t>
-      </w:r>
-    </w:p>
-    <w:p>
-      <w:pPr>
-        <w:pStyle w:val="ListParagraph"/>
-        <w:numPr>
-          <w:ilvl w:val="0"/>
-          <w:numId w:val="2"/>
-        </w:numPr>
-        <w:spacing w:after="60"/>
-      </w:pPr>
-      <w:r>
-        <w:rPr>
-          <w:b/>
-          <w:bCs/>
-        </w:rPr>
-        <w:t xml:space="preserve">LingoBoard (dashboards educacionais):</w:t>
-      </w:r>
-      <w:r>
-        <w:rPr>
-          <w:b w:val="false"/>
-          <w:bCs w:val="false"/>
-        </w:rPr>
-        <w:t xml:space="preserve"> Business Intelligence para gestão escolar; consolida planilhas de notas e chamadas em painéis visuais interativos, identificando alunos em risco de evasão e turmas com baixo rendimento.</w:t>
-      </w:r>
-    </w:p>
-    <w:p>
-      <w:pPr>
-        <w:pStyle w:val="ListParagraph"/>
-        <w:numPr>
-          <w:ilvl w:val="0"/>
-          <w:numId w:val="2"/>
-        </w:numPr>
-        <w:spacing w:after="60"/>
-      </w:pPr>
-      <w:r>
-        <w:rPr>
-          <w:b/>
-          <w:bCs/>
-        </w:rPr>
-        <w:t xml:space="preserve">VocabDeck (revisão de vocabulário):</w:t>
-      </w:r>
-      <w:r>
-        <w:rPr>
-          <w:b w:val="false"/>
-          <w:bCs w:val="false"/>
-        </w:rPr>
-        <w:t xml:space="preserve"> aplicação web de flashcards com repetição espaçada; o professor cadastra o vocabulário das aulas e os alunos praticam.</w:t>
-      </w:r>
-    </w:p>
-    <w:p>
-      <w:pPr>
-        <w:pStyle w:val="ListParagraph"/>
-        <w:numPr>
-          <w:ilvl w:val="0"/>
-          <w:numId w:val="2"/>
-        </w:numPr>
-        <w:spacing w:after="60"/>
-      </w:pPr>
-      <w:r>
-        <w:rPr>
-          <w:b/>
-          <w:bCs/>
-        </w:rPr>
-        <w:t xml:space="preserve">EduLanding (páginas web educacionais):</w:t>
-      </w:r>
-      <w:r>
-        <w:rPr>
-          <w:b w:val="false"/>
-          <w:bCs w:val="false"/>
-        </w:rPr>
-        <w:t xml:space="preserve"> sites institucionais e landing pages para projetos das escolas (feiras culturais, simulados, portais de materiais), responsivos para acesso via celular.</w:t>
-      </w:r>
-    </w:p>
-    <w:p>
-      <w:pPr>
-        <w:pStyle w:val="ListParagraph"/>
-        <w:numPr>
-          <w:ilvl w:val="0"/>
-          <w:numId w:val="2"/>
-        </w:numPr>
-        <w:spacing w:after="60"/>
-      </w:pPr>
-      <w:r>
-        <w:rPr>
-          <w:b/>
-          <w:bCs/>
-        </w:rPr>
-        <w:t xml:space="preserve">BabelUX (redesign de interfaces):</w:t>
-      </w:r>
-      <w:r>
-        <w:rPr>
-          <w:b w:val="false"/>
-          <w:bCs w:val="false"/>
-        </w:rPr>
-        <w:t xml:space="preserve"> consultoria de UX/UI que aplica heurísticas de usabilidade para tornar ambientes de estudo mais acessíveis e com menor carga cognitiva.</w:t>
-      </w:r>
-    </w:p>
-    <w:p>
-      <w:pPr>
-        <w:pStyle w:val="ListParagraph"/>
-        <w:numPr>
-          <w:ilvl w:val="0"/>
-          <w:numId w:val="2"/>
-        </w:numPr>
-        <w:spacing w:after="60"/>
-      </w:pPr>
-      <w:r>
-        <w:rPr>
-          <w:b/>
-          <w:bCs/>
-        </w:rPr>
-        <w:t xml:space="preserve">IntegraSchool (automação administrativa):</w:t>
-      </w:r>
-      <w:r>
-        <w:rPr>
-          <w:b w:val="false"/>
-          <w:bCs w:val="false"/>
-        </w:rPr>
-        <w:t xml:space="preserve"> scripts em Python que automatizam rotinas do professor (resumos de aula, lembretes, organização de arquivos), poupando tempo de planejamento.</w:t>
+        <w:t xml:space="preserve">Por ser formada por estudantes de Sistemas de Informação, a BabelStack Júnior estruturou um portfólio enxuto e inteligente, com tecnologias consolidadas (desenvolvimento web, análise de dados e design de interfaces) que garantem viabilidade técnica de execução pela dupla e alto valor para as escolas. São cinco produtos distintos, cada um endereçando uma dor específica do público-alvo:</w:t>
+      </w:r>
+    </w:p>
+    <w:p>
+      <w:pPr>
+        <w:pStyle w:val="ListParagraph"/>
+        <w:numPr>
+          <w:ilvl w:val="0"/>
+          <w:numId w:val="2"/>
+        </w:numPr>
+        <w:spacing w:after="60"/>
+      </w:pPr>
+      <w:r>
+        <w:rPr>
+          <w:b/>
+          <w:bCs/>
+        </w:rPr>
+        <w:t xml:space="preserve">LingoBoard — dashboards educacionais (BI).</w:t>
+      </w:r>
+      <w:r>
+        <w:rPr>
+          <w:b w:val="false"/>
+          <w:bCs w:val="false"/>
+        </w:rPr>
+        <w:t xml:space="preserve"> Resolve a dificuldade dos gestores em enxergar evasão e baixo rendimento a tempo: consolida planilhas de notas e chamadas em painéis visuais interativos (Python/Streamlit), destacando alunos e turmas em risco.</w:t>
+      </w:r>
+    </w:p>
+    <w:p>
+      <w:pPr>
+        <w:pStyle w:val="ListParagraph"/>
+        <w:numPr>
+          <w:ilvl w:val="0"/>
+          <w:numId w:val="2"/>
+        </w:numPr>
+        <w:spacing w:after="60"/>
+      </w:pPr>
+      <w:r>
+        <w:rPr>
+          <w:b/>
+          <w:bCs/>
+        </w:rPr>
+        <w:t xml:space="preserve">VocabDeck — plataforma web de flashcards.</w:t>
+      </w:r>
+      <w:r>
+        <w:rPr>
+          <w:b w:val="false"/>
+          <w:bCs w:val="false"/>
+        </w:rPr>
+        <w:t xml:space="preserve"> Resolve a passividade do estudo fora da sala: aplicação de revisão espaçada em que o professor cadastra o vocabulário das aulas e os alunos praticam de forma gamificada.</w:t>
+      </w:r>
+    </w:p>
+    <w:p>
+      <w:pPr>
+        <w:pStyle w:val="ListParagraph"/>
+        <w:numPr>
+          <w:ilvl w:val="0"/>
+          <w:numId w:val="2"/>
+        </w:numPr>
+        <w:spacing w:after="60"/>
+      </w:pPr>
+      <w:r>
+        <w:rPr>
+          <w:b/>
+          <w:bCs/>
+        </w:rPr>
+        <w:t xml:space="preserve">EduLanding — páginas web educacionais.</w:t>
+      </w:r>
+      <w:r>
+        <w:rPr>
+          <w:b w:val="false"/>
+          <w:bCs w:val="false"/>
+        </w:rPr>
+        <w:t xml:space="preserve"> Resolve a ausência de presença digital das escolas: template responsivo (HTML/CSS/JS) para feiras culturais, simulados de proficiência e portais de materiais, fácil de editar pela própria instituição.</w:t>
+      </w:r>
+    </w:p>
+    <w:p>
+      <w:pPr>
+        <w:pStyle w:val="ListParagraph"/>
+        <w:numPr>
+          <w:ilvl w:val="0"/>
+          <w:numId w:val="2"/>
+        </w:numPr>
+        <w:spacing w:after="60"/>
+      </w:pPr>
+      <w:r>
+        <w:rPr>
+          <w:b/>
+          <w:bCs/>
+        </w:rPr>
+        <w:t xml:space="preserve">BabelUX — redesign de interfaces (UX/UI).</w:t>
+      </w:r>
+      <w:r>
+        <w:rPr>
+          <w:b w:val="false"/>
+          <w:bCs w:val="false"/>
+        </w:rPr>
+        <w:t xml:space="preserve"> Resolve as interfaces confusas que afastam o aluno: consultoria que aplica heurísticas de usabilidade para tornar portais educacionais mais acessíveis e com menor carga cognitiva.</w:t>
+      </w:r>
+    </w:p>
+    <w:p>
+      <w:pPr>
+        <w:pStyle w:val="ListParagraph"/>
+        <w:numPr>
+          <w:ilvl w:val="0"/>
+          <w:numId w:val="2"/>
+        </w:numPr>
+        <w:spacing w:after="60"/>
+      </w:pPr>
+      <w:r>
+        <w:rPr>
+          <w:b/>
+          <w:bCs/>
+        </w:rPr>
+        <w:t xml:space="preserve">IntegraSchool — automação administrativa.</w:t>
+      </w:r>
+      <w:r>
+        <w:rPr>
+          <w:b w:val="false"/>
+          <w:bCs w:val="false"/>
+        </w:rPr>
+        <w:t xml:space="preserve"> Resolve o tempo perdido com burocracia: scripts em Python (modo simulação) que automatizam resumos de aula, lembretes e organização de arquivos, devolvendo horas ao professor.</w:t>
       </w:r>
     </w:p>
     <w:p>
@@ -743,7 +743,7 @@
           <w:b w:val="false"/>
           <w:bCs w:val="false"/>
         </w:rPr>
-        <w:t xml:space="preserve">A BabelStack Júnior atuará como a ponte tecnológica que falta na rede pública do DF. Ao automatizar a burocracia e modernizar o acompanhamento pedagógico, devolve ao professor o tempo para ensinar; para os estudantes, transforma o aprendizado passivo de idiomas em uma experiência digital, gamificada e fluida.</w:t>
+        <w:t xml:space="preserve">A BabelStack Júnior atuará como a ponte tecnológica que falta na rede pública do DF. Ao automatizar a burocracia e modernizar o acompanhamento pedagógico, devolve ao professor o tempo para o que realmente importa: ensinar. Para os estudantes, transforma o aprendizado passivo de idiomas — baseado em lousa e caderno — em uma experiência digital, gamificada e fluida, que engaja jovens já nativos digitais. Esse compromisso social é formalizado no programa "Código Fluente": a cada três projetos pagos no setor privado, a empresa implanta gratuitamente um sistema (LingoBoard ou IntegraSchool) em uma escola pública.</w:t>
       </w:r>
     </w:p>
     <w:p>
@@ -775,7 +775,7 @@
           <w:b w:val="false"/>
           <w:bCs w:val="false"/>
         </w:rPr>
-        <w:t xml:space="preserve"> composta por estudantes inseridos no ecossistema atual de tecnologia, entende o comportamento do usuário jovem.</w:t>
+        <w:t xml:space="preserve"> formada por estudantes inseridos no ecossistema atual de tecnologia, a empresa entende o comportamento do usuário jovem e cria interfaces que conversam com esse público.</w:t>
       </w:r>
     </w:p>
     <w:p>
@@ -799,7 +799,7 @@
           <w:b w:val="false"/>
           <w:bCs w:val="false"/>
         </w:rPr>
-        <w:t xml:space="preserve"> todas as metodologias são voltadas estritamente à dor educacional do ensino de línguas.</w:t>
+        <w:t xml:space="preserve"> diferentemente de fábricas de software genéricas, todo o desenvolvimento, banco de dados e design são voltados estritamente à dor do ensino de línguas.</w:t>
       </w:r>
     </w:p>
     <w:p>
@@ -823,7 +823,7 @@
           <w:b w:val="false"/>
           <w:bCs w:val="false"/>
         </w:rPr>
-        <w:t xml:space="preserve"> prioriza tecnologias de código aberto e ferramentas gratuitas, tornando as soluções acessíveis a instituições públicas e professores independentes.</w:t>
+        <w:t xml:space="preserve"> o uso de tecnologias de código aberto e ferramentas gratuitas torna as soluções acessíveis a instituições públicas e a professores independentes.</w:t>
       </w:r>
     </w:p>
     <w:p>
@@ -855,7 +855,7 @@
           <w:b w:val="false"/>
           <w:bCs w:val="false"/>
         </w:rPr>
-        <w:t xml:space="preserve"> gestores e professores passam a ter métricas exatas sobre o progresso das turmas.</w:t>
+        <w:t xml:space="preserve"> gestores e professores passam a ter métricas exatas sobre o progresso das turmas, no lugar do "achismo".</w:t>
       </w:r>
     </w:p>
     <w:p>
@@ -903,7 +903,7 @@
           <w:b w:val="false"/>
           <w:bCs w:val="false"/>
         </w:rPr>
-        <w:t xml:space="preserve"> cada solução é estruturada conforme o plano de ensino específico do professor cliente.</w:t>
+        <w:t xml:space="preserve"> cada solução é estruturada conforme o plano de ensino específico do professor cliente, respeitando a realidade da comunidade.</w:t>
       </w:r>
     </w:p>
     <w:p>
@@ -917,6 +917,18 @@
     </w:p>
     <w:p>
       <w:pPr>
+        <w:spacing w:after="120"/>
+      </w:pPr>
+      <w:r>
+        <w:rPr>
+          <w:b w:val="false"/>
+          <w:bCs w:val="false"/>
+        </w:rPr>
+        <w:t xml:space="preserve">O planejamento segue uma progressão clara e realista para uma Empresa Júnior de dois fundadores: primeiro validar com projetos-piloto, depois alcançar sustentabilidade financeira e, por fim, agregar inovação analítica. Cada horizonte se apoia nas conquistas do anterior.</w:t>
+      </w:r>
+    </w:p>
+    <w:p>
+      <w:pPr>
         <w:pStyle w:val="Heading2"/>
       </w:pPr>
       <w:r>
@@ -944,31 +956,31 @@
           <w:b w:val="false"/>
           <w:bCs w:val="false"/>
         </w:rPr>
-        <w:t xml:space="preserve"> entrevistar professores de inglês da rede pública e levantar requisitos; definir tecnologias, frameworks e ferramentas de design (Figma e frameworks web) de rápida adoção.</w:t>
-      </w:r>
-    </w:p>
-    <w:p>
-      <w:pPr>
-        <w:pStyle w:val="ListParagraph"/>
-        <w:numPr>
-          <w:ilvl w:val="0"/>
-          <w:numId w:val="2"/>
-        </w:numPr>
-        <w:spacing w:after="60"/>
-      </w:pPr>
-      <w:r>
-        <w:rPr>
-          <w:b/>
-          <w:bCs/>
-        </w:rPr>
-        <w:t xml:space="preserve">Capacitação da equipe:</w:t>
-      </w:r>
-      <w:r>
-        <w:rPr>
-          <w:b w:val="false"/>
-          <w:bCs w:val="false"/>
-        </w:rPr>
-        <w:t xml:space="preserve"> treinar os membros nas tecnologias definidas, com foco em Python (dados) e fundamentos de UX/UI.</w:t>
+        <w:t xml:space="preserve"> entrevistar professores de inglês da rede pública do DF para mapear dores reais e definir a stack open-source (Python, PostgreSQL, HTML/CSS/JS, Streamlit, Figma, GitHub) de rápida adoção.</w:t>
+      </w:r>
+    </w:p>
+    <w:p>
+      <w:pPr>
+        <w:pStyle w:val="ListParagraph"/>
+        <w:numPr>
+          <w:ilvl w:val="0"/>
+          <w:numId w:val="2"/>
+        </w:numPr>
+        <w:spacing w:after="60"/>
+      </w:pPr>
+      <w:r>
+        <w:rPr>
+          <w:b/>
+          <w:bCs/>
+        </w:rPr>
+        <w:t xml:space="preserve">Capacitação da dupla:</w:t>
+      </w:r>
+      <w:r>
+        <w:rPr>
+          <w:b w:val="false"/>
+          <w:bCs w:val="false"/>
+        </w:rPr>
+        <w:t xml:space="preserve"> dividir o estudo conforme os papéis — Raquel aprofunda UX/UI e Business Intelligence; Roger, desenvolvimento web e automação — usando cursos gratuitos e a documentação das ferramentas.</w:t>
       </w:r>
     </w:p>
     <w:p>
@@ -992,7 +1004,7 @@
           <w:b w:val="false"/>
           <w:bCs w:val="false"/>
         </w:rPr>
-        <w:t xml:space="preserve"> firmar parcerias gratuitas de validação com 2 a 3 professores do DF, implementando protótipos (LingoBoard, automações) e formando o primeiro portfólio de casos reais.</w:t>
+        <w:t xml:space="preserve"> firmar parcerias gratuitas de validação com 2 a 3 professores [estimativa], implantando os primeiros protótipos (LingoBoard e uma automação do IntegraSchool) e coletando métricas de usabilidade para formar o portfólio de casos reais.</w:t>
       </w:r>
     </w:p>
     <w:p>
@@ -1024,7 +1036,7 @@
           <w:b w:val="false"/>
           <w:bCs w:val="false"/>
         </w:rPr>
-        <w:t xml:space="preserve"> comercializar os serviços para escolas particulares, plataformas de cursos e professores independentes, custeando servidores, licenças e participação em congressos.</w:t>
+        <w:t xml:space="preserve"> começar a comercializar os serviços para escolas de idiomas particulares e professores independentes, usando a receita para custear o domínio, eventuais servidores e a participação em eventos de tecnologia.</w:t>
       </w:r>
     </w:p>
     <w:p>
@@ -1048,31 +1060,31 @@
           <w:b w:val="false"/>
           <w:bCs w:val="false"/>
         </w:rPr>
-        <w:t xml:space="preserve"> ampliar a arquitetura para suportar espanhol e francês, além do inglês.</w:t>
-      </w:r>
-    </w:p>
-    <w:p>
-      <w:pPr>
-        <w:pStyle w:val="ListParagraph"/>
-        <w:numPr>
-          <w:ilvl w:val="0"/>
-          <w:numId w:val="2"/>
-        </w:numPr>
-        <w:spacing w:after="60"/>
-      </w:pPr>
-      <w:r>
-        <w:rPr>
-          <w:b/>
-          <w:bCs/>
-        </w:rPr>
-        <w:t xml:space="preserve">Evolução da arquitetura:</w:t>
-      </w:r>
-      <w:r>
-        <w:rPr>
-          <w:b w:val="false"/>
-          <w:bCs w:val="false"/>
-        </w:rPr>
-        <w:t xml:space="preserve"> migrar gradualmente soluções low-code para desenvolvimento fullstack (frameworks como React e Node.js).</w:t>
+        <w:t xml:space="preserve"> evoluir a arquitetura multidiomas para atender também espanhol e francês, replicando as soluções de inglês com baixo custo de adaptação.</w:t>
+      </w:r>
+    </w:p>
+    <w:p>
+      <w:pPr>
+        <w:pStyle w:val="ListParagraph"/>
+        <w:numPr>
+          <w:ilvl w:val="0"/>
+          <w:numId w:val="2"/>
+        </w:numPr>
+        <w:spacing w:after="60"/>
+      </w:pPr>
+      <w:r>
+        <w:rPr>
+          <w:b/>
+          <w:bCs/>
+        </w:rPr>
+        <w:t xml:space="preserve">Evolução da arquitetura de software:</w:t>
+      </w:r>
+      <w:r>
+        <w:rPr>
+          <w:b w:val="false"/>
+          <w:bCs w:val="false"/>
+        </w:rPr>
+        <w:t xml:space="preserve"> migrar gradualmente protótipos low-code para desenvolvimento fullstack (por exemplo, com frameworks como React e Node.js), elevando o nível técnico das entregas.</w:t>
       </w:r>
     </w:p>
     <w:p>
@@ -1104,7 +1116,7 @@
           <w:b w:val="false"/>
           <w:bCs w:val="false"/>
         </w:rPr>
-        <w:t xml:space="preserve"> introduzir modelos estatísticos que emitam alertas sobre alunos com tendência a evasão.</w:t>
+        <w:t xml:space="preserve"> introduzir modelos estatísticos simples que analisem o histórico de notas e emitam alertas automáticos sobre alunos com tendência a evadir, entregando valor técnico de ponta aos clientes.</w:t>
       </w:r>
     </w:p>
     <w:p>
@@ -1128,7 +1140,7 @@
           <w:b w:val="false"/>
           <w:bCs w:val="false"/>
         </w:rPr>
-        <w:t xml:space="preserve"> implementar os sistemas oficialmente em centros de ensino de idiomas parceiros.</w:t>
+        <w:t xml:space="preserve"> implantar os sistemas de forma oficial em centros de ensino de idiomas de universidades ou faculdades parceiras.</w:t>
       </w:r>
     </w:p>
     <w:p>
@@ -1152,7 +1164,7 @@
           <w:b w:val="false"/>
           <w:bCs w:val="false"/>
         </w:rPr>
-        <w:t xml:space="preserve"> consolidar a marca como celeiro de talentos no nicho de tecnologia educacional.</w:t>
+        <w:t xml:space="preserve"> consolidar a marca BabelStack Júnior como celeiro de talentos locais no nicho de tecnologia educacional.</w:t>
       </w:r>
     </w:p>
     <w:p>

</xml_diff>